<commit_message>
Ajoute les plannings du mardi et du mercredi
L'extraction détecte désormais les colonnes de terrains d'elle-même et
coupe les cellules sur les numéros d'élèves : une ligne trop longue qui
débordait sur le terrain voisin avalait la ligne suivante, et le mardi
perdait un élève. La largeur des colonnes et l'interligne s'ajustent au
nombre de terrains et de créneaux pour tenir sur une page A3.

Co-Authored-By: Claude Opus 5 <noreply@anthropic.com>
Claude-Session: https://claude.ai/code/session_01RsDkbcD3KwyPviDTcs72WZ
</commit_message>
<xml_diff>
--- a/Planning_lundi_2026-2027.docx
+++ b/Planning_lundi_2026-2027.docx
@@ -4,7 +4,7 @@
   <w:body>
     <w:tbl>
       <w:tblPr>
-        <w:tblW w:type="dxa" w:w="22644"/>
+        <w:tblW w:type="dxa" w:w="22788"/>
         <w:tblBorders>
           <w:top w:val="none" w:color="FFFFFF" w:sz="0"/>
           <w:left w:val="none" w:color="FFFFFF" w:sz="0"/>
@@ -143,7 +143,7 @@
     </w:p>
     <w:tbl>
       <w:tblPr>
-        <w:tblW w:type="dxa" w:w="22644"/>
+        <w:tblW w:type="dxa" w:w="22788"/>
         <w:tblBorders>
           <w:top w:val="single" w:color="8A9E28" w:sz="6"/>
           <w:left w:val="single" w:color="8A9E28" w:sz="6"/>
@@ -155,15 +155,15 @@
       </w:tblPr>
       <w:tblGrid>
         <w:gridCol w:w="963"/>
-        <w:gridCol w:w="2409"/>
-        <w:gridCol w:w="2409"/>
-        <w:gridCol w:w="2409"/>
-        <w:gridCol w:w="2409"/>
-        <w:gridCol w:w="2409"/>
-        <w:gridCol w:w="2409"/>
-        <w:gridCol w:w="2409"/>
-        <w:gridCol w:w="2409"/>
-        <w:gridCol w:w="2409"/>
+        <w:gridCol w:w="2425"/>
+        <w:gridCol w:w="2425"/>
+        <w:gridCol w:w="2425"/>
+        <w:gridCol w:w="2425"/>
+        <w:gridCol w:w="2425"/>
+        <w:gridCol w:w="2425"/>
+        <w:gridCol w:w="2425"/>
+        <w:gridCol w:w="2425"/>
+        <w:gridCol w:w="2425"/>
       </w:tblGrid>
       <w:tr>
         <w:trPr>
@@ -202,7 +202,7 @@
         </w:tc>
         <w:tc>
           <w:tcPr>
-            <w:tcW w:type="dxa" w:w="2409"/>
+            <w:tcW w:type="dxa" w:w="2425"/>
             <w:shd w:fill="8A9E28" w:color="auto" w:val="clear"/>
             <w:tcMar>
               <w:top w:type="dxa" w:w="39"/>
@@ -232,7 +232,7 @@
         </w:tc>
         <w:tc>
           <w:tcPr>
-            <w:tcW w:type="dxa" w:w="2409"/>
+            <w:tcW w:type="dxa" w:w="2425"/>
             <w:shd w:fill="8A9E28" w:color="auto" w:val="clear"/>
             <w:tcMar>
               <w:top w:type="dxa" w:w="39"/>
@@ -262,7 +262,7 @@
         </w:tc>
         <w:tc>
           <w:tcPr>
-            <w:tcW w:type="dxa" w:w="2409"/>
+            <w:tcW w:type="dxa" w:w="2425"/>
             <w:shd w:fill="8A9E28" w:color="auto" w:val="clear"/>
             <w:tcMar>
               <w:top w:type="dxa" w:w="39"/>
@@ -292,7 +292,7 @@
         </w:tc>
         <w:tc>
           <w:tcPr>
-            <w:tcW w:type="dxa" w:w="2409"/>
+            <w:tcW w:type="dxa" w:w="2425"/>
             <w:shd w:fill="8A9E28" w:color="auto" w:val="clear"/>
             <w:tcMar>
               <w:top w:type="dxa" w:w="39"/>
@@ -322,7 +322,7 @@
         </w:tc>
         <w:tc>
           <w:tcPr>
-            <w:tcW w:type="dxa" w:w="2409"/>
+            <w:tcW w:type="dxa" w:w="2425"/>
             <w:shd w:fill="8A9E28" w:color="auto" w:val="clear"/>
             <w:tcMar>
               <w:top w:type="dxa" w:w="39"/>
@@ -352,7 +352,7 @@
         </w:tc>
         <w:tc>
           <w:tcPr>
-            <w:tcW w:type="dxa" w:w="2409"/>
+            <w:tcW w:type="dxa" w:w="2425"/>
             <w:shd w:fill="8A9E28" w:color="auto" w:val="clear"/>
             <w:tcMar>
               <w:top w:type="dxa" w:w="39"/>
@@ -382,7 +382,7 @@
         </w:tc>
         <w:tc>
           <w:tcPr>
-            <w:tcW w:type="dxa" w:w="2409"/>
+            <w:tcW w:type="dxa" w:w="2425"/>
             <w:shd w:fill="8A9E28" w:color="auto" w:val="clear"/>
             <w:tcMar>
               <w:top w:type="dxa" w:w="39"/>
@@ -412,7 +412,7 @@
         </w:tc>
         <w:tc>
           <w:tcPr>
-            <w:tcW w:type="dxa" w:w="2409"/>
+            <w:tcW w:type="dxa" w:w="2425"/>
             <w:shd w:fill="8A9E28" w:color="auto" w:val="clear"/>
             <w:tcMar>
               <w:top w:type="dxa" w:w="39"/>
@@ -442,7 +442,7 @@
         </w:tc>
         <w:tc>
           <w:tcPr>
-            <w:tcW w:type="dxa" w:w="2409"/>
+            <w:tcW w:type="dxa" w:w="2425"/>
             <w:shd w:fill="8A9E28" w:color="auto" w:val="clear"/>
             <w:tcMar>
               <w:top w:type="dxa" w:w="39"/>
@@ -507,7 +507,7 @@
         </w:tc>
         <w:tc>
           <w:tcPr>
-            <w:tcW w:type="dxa" w:w="2409"/>
+            <w:tcW w:type="dxa" w:w="2425"/>
             <w:shd w:fill="FFFFFF" w:color="auto" w:val="clear"/>
             <w:tcMar>
               <w:top w:type="dxa" w:w="39"/>
@@ -534,7 +534,7 @@
         </w:tc>
         <w:tc>
           <w:tcPr>
-            <w:tcW w:type="dxa" w:w="2409"/>
+            <w:tcW w:type="dxa" w:w="2425"/>
             <w:shd w:fill="FFFFFF" w:color="auto" w:val="clear"/>
             <w:tcMar>
               <w:top w:type="dxa" w:w="39"/>
@@ -561,7 +561,7 @@
         </w:tc>
         <w:tc>
           <w:tcPr>
-            <w:tcW w:type="dxa" w:w="2409"/>
+            <w:tcW w:type="dxa" w:w="2425"/>
             <w:shd w:fill="FFFFFF" w:color="auto" w:val="clear"/>
             <w:tcMar>
               <w:top w:type="dxa" w:w="39"/>
@@ -588,7 +588,7 @@
         </w:tc>
         <w:tc>
           <w:tcPr>
-            <w:tcW w:type="dxa" w:w="2409"/>
+            <w:tcW w:type="dxa" w:w="2425"/>
             <w:shd w:fill="FFFFFF" w:color="auto" w:val="clear"/>
             <w:tcMar>
               <w:top w:type="dxa" w:w="39"/>
@@ -615,7 +615,7 @@
         </w:tc>
         <w:tc>
           <w:tcPr>
-            <w:tcW w:type="dxa" w:w="2409"/>
+            <w:tcW w:type="dxa" w:w="2425"/>
             <w:shd w:fill="FFFFFF" w:color="auto" w:val="clear"/>
             <w:tcMar>
               <w:top w:type="dxa" w:w="39"/>
@@ -642,7 +642,7 @@
         </w:tc>
         <w:tc>
           <w:tcPr>
-            <w:tcW w:type="dxa" w:w="2409"/>
+            <w:tcW w:type="dxa" w:w="2425"/>
             <w:shd w:fill="FFFFFF" w:color="auto" w:val="clear"/>
             <w:tcMar>
               <w:top w:type="dxa" w:w="39"/>
@@ -669,7 +669,7 @@
         </w:tc>
         <w:tc>
           <w:tcPr>
-            <w:tcW w:type="dxa" w:w="2409"/>
+            <w:tcW w:type="dxa" w:w="2425"/>
             <w:shd w:fill="FFFFFF" w:color="auto" w:val="clear"/>
             <w:tcMar>
               <w:top w:type="dxa" w:w="39"/>
@@ -696,7 +696,7 @@
         </w:tc>
         <w:tc>
           <w:tcPr>
-            <w:tcW w:type="dxa" w:w="2409"/>
+            <w:tcW w:type="dxa" w:w="2425"/>
             <w:shd w:fill="FFFFFF" w:color="auto" w:val="clear"/>
             <w:tcMar>
               <w:top w:type="dxa" w:w="39"/>
@@ -844,7 +844,7 @@
         </w:tc>
         <w:tc>
           <w:tcPr>
-            <w:tcW w:type="dxa" w:w="2409"/>
+            <w:tcW w:type="dxa" w:w="2425"/>
             <w:shd w:fill="FFFFFF" w:color="auto" w:val="clear"/>
             <w:tcMar>
               <w:top w:type="dxa" w:w="39"/>
@@ -906,7 +906,7 @@
         </w:tc>
         <w:tc>
           <w:tcPr>
-            <w:tcW w:type="dxa" w:w="2409"/>
+            <w:tcW w:type="dxa" w:w="2425"/>
             <w:shd w:fill="FAFAF6" w:color="auto" w:val="clear"/>
             <w:tcMar>
               <w:top w:type="dxa" w:w="39"/>
@@ -933,7 +933,7 @@
         </w:tc>
         <w:tc>
           <w:tcPr>
-            <w:tcW w:type="dxa" w:w="2409"/>
+            <w:tcW w:type="dxa" w:w="2425"/>
             <w:shd w:fill="FAFAF6" w:color="auto" w:val="clear"/>
             <w:tcMar>
               <w:top w:type="dxa" w:w="39"/>
@@ -1081,7 +1081,7 @@
         </w:tc>
         <w:tc>
           <w:tcPr>
-            <w:tcW w:type="dxa" w:w="2409"/>
+            <w:tcW w:type="dxa" w:w="2425"/>
             <w:shd w:fill="FAFAF6" w:color="auto" w:val="clear"/>
             <w:tcMar>
               <w:top w:type="dxa" w:w="39"/>
@@ -1108,7 +1108,7 @@
         </w:tc>
         <w:tc>
           <w:tcPr>
-            <w:tcW w:type="dxa" w:w="2409"/>
+            <w:tcW w:type="dxa" w:w="2425"/>
             <w:shd w:fill="FAFAF6" w:color="auto" w:val="clear"/>
             <w:tcMar>
               <w:top w:type="dxa" w:w="39"/>
@@ -1135,7 +1135,7 @@
         </w:tc>
         <w:tc>
           <w:tcPr>
-            <w:tcW w:type="dxa" w:w="2409"/>
+            <w:tcW w:type="dxa" w:w="2425"/>
             <w:shd w:fill="FAFAF6" w:color="auto" w:val="clear"/>
             <w:tcMar>
               <w:top w:type="dxa" w:w="39"/>
@@ -1283,7 +1283,7 @@
         </w:tc>
         <w:tc>
           <w:tcPr>
-            <w:tcW w:type="dxa" w:w="2409"/>
+            <w:tcW w:type="dxa" w:w="2425"/>
             <w:shd w:fill="FAFAF6" w:color="auto" w:val="clear"/>
             <w:tcMar>
               <w:top w:type="dxa" w:w="39"/>
@@ -1408,7 +1408,7 @@
         </w:tc>
         <w:tc>
           <w:tcPr>
-            <w:tcW w:type="dxa" w:w="2409"/>
+            <w:tcW w:type="dxa" w:w="2425"/>
             <w:shd w:fill="FAFAF6" w:color="auto" w:val="clear"/>
             <w:tcMar>
               <w:top w:type="dxa" w:w="39"/>
@@ -1533,7 +1533,7 @@
         </w:tc>
         <w:tc>
           <w:tcPr>
-            <w:tcW w:type="dxa" w:w="2409"/>
+            <w:tcW w:type="dxa" w:w="2425"/>
             <w:shd w:fill="FAFAF6" w:color="auto" w:val="clear"/>
             <w:tcMar>
               <w:top w:type="dxa" w:w="39"/>
@@ -1560,7 +1560,7 @@
         </w:tc>
         <w:tc>
           <w:tcPr>
-            <w:tcW w:type="dxa" w:w="2409"/>
+            <w:tcW w:type="dxa" w:w="2425"/>
             <w:shd w:fill="FAFAF6" w:color="auto" w:val="clear"/>
             <w:tcMar>
               <w:top w:type="dxa" w:w="39"/>
@@ -1622,7 +1622,7 @@
         </w:tc>
         <w:tc>
           <w:tcPr>
-            <w:tcW w:type="dxa" w:w="2409"/>
+            <w:tcW w:type="dxa" w:w="2425"/>
             <w:shd w:fill="FFFFFF" w:color="auto" w:val="clear"/>
             <w:tcMar>
               <w:top w:type="dxa" w:w="39"/>
@@ -1649,7 +1649,7 @@
         </w:tc>
         <w:tc>
           <w:tcPr>
-            <w:tcW w:type="dxa" w:w="2409"/>
+            <w:tcW w:type="dxa" w:w="2425"/>
             <w:shd w:fill="FFFFFF" w:color="auto" w:val="clear"/>
             <w:tcMar>
               <w:top w:type="dxa" w:w="39"/>
@@ -1676,7 +1676,7 @@
         </w:tc>
         <w:tc>
           <w:tcPr>
-            <w:tcW w:type="dxa" w:w="2409"/>
+            <w:tcW w:type="dxa" w:w="2425"/>
             <w:shd w:fill="FFFFFF" w:color="auto" w:val="clear"/>
             <w:tcMar>
               <w:top w:type="dxa" w:w="39"/>
@@ -1703,7 +1703,7 @@
         </w:tc>
         <w:tc>
           <w:tcPr>
-            <w:tcW w:type="dxa" w:w="2409"/>
+            <w:tcW w:type="dxa" w:w="2425"/>
             <w:shd w:fill="FFFFFF" w:color="auto" w:val="clear"/>
             <w:tcMar>
               <w:top w:type="dxa" w:w="39"/>
@@ -1730,7 +1730,7 @@
         </w:tc>
         <w:tc>
           <w:tcPr>
-            <w:tcW w:type="dxa" w:w="2409"/>
+            <w:tcW w:type="dxa" w:w="2425"/>
             <w:shd w:fill="FFFFFF" w:color="auto" w:val="clear"/>
             <w:tcMar>
               <w:top w:type="dxa" w:w="39"/>
@@ -1757,7 +1757,7 @@
         </w:tc>
         <w:tc>
           <w:tcPr>
-            <w:tcW w:type="dxa" w:w="2409"/>
+            <w:tcW w:type="dxa" w:w="2425"/>
             <w:shd w:fill="FFFFFF" w:color="auto" w:val="clear"/>
             <w:tcMar>
               <w:top w:type="dxa" w:w="39"/>
@@ -1905,7 +1905,7 @@
         </w:tc>
         <w:tc>
           <w:tcPr>
-            <w:tcW w:type="dxa" w:w="2409"/>
+            <w:tcW w:type="dxa" w:w="2425"/>
             <w:shd w:fill="FFFFFF" w:color="auto" w:val="clear"/>
             <w:tcMar>
               <w:top w:type="dxa" w:w="39"/>
@@ -1975,7 +1975,7 @@
         </w:tc>
         <w:tc>
           <w:tcPr>
-            <w:tcW w:type="dxa" w:w="2409"/>
+            <w:tcW w:type="dxa" w:w="2425"/>
             <w:shd w:fill="FFFFFF" w:color="auto" w:val="clear"/>
             <w:tcMar>
               <w:top w:type="dxa" w:w="39"/>
@@ -2123,7 +2123,7 @@
         </w:tc>
         <w:tc>
           <w:tcPr>
-            <w:tcW w:type="dxa" w:w="2409"/>
+            <w:tcW w:type="dxa" w:w="2425"/>
             <w:shd w:fill="FFFFFF" w:color="auto" w:val="clear"/>
             <w:tcMar>
               <w:top w:type="dxa" w:w="39"/>
@@ -2228,7 +2228,7 @@
         </w:tc>
         <w:tc>
           <w:tcPr>
-            <w:tcW w:type="dxa" w:w="2409"/>
+            <w:tcW w:type="dxa" w:w="2425"/>
             <w:shd w:fill="FAFAF6" w:color="auto" w:val="clear"/>
             <w:tcMar>
               <w:top w:type="dxa" w:w="39"/>
@@ -2491,7 +2491,7 @@
         </w:tc>
         <w:tc>
           <w:tcPr>
-            <w:tcW w:type="dxa" w:w="2409"/>
+            <w:tcW w:type="dxa" w:w="2425"/>
             <w:shd w:fill="FAFAF6" w:color="auto" w:val="clear"/>
             <w:tcMar>
               <w:top w:type="dxa" w:w="39"/>
@@ -2685,7 +2685,7 @@
         </w:tc>
         <w:tc>
           <w:tcPr>
-            <w:tcW w:type="dxa" w:w="2409"/>
+            <w:tcW w:type="dxa" w:w="2425"/>
             <w:shd w:fill="FAFAF6" w:color="auto" w:val="clear"/>
             <w:tcMar>
               <w:top w:type="dxa" w:w="39"/>
@@ -2879,7 +2879,7 @@
         </w:tc>
         <w:tc>
           <w:tcPr>
-            <w:tcW w:type="dxa" w:w="2409"/>
+            <w:tcW w:type="dxa" w:w="2425"/>
             <w:shd w:fill="FAFAF6" w:color="auto" w:val="clear"/>
             <w:tcMar>
               <w:top w:type="dxa" w:w="39"/>
@@ -3073,7 +3073,7 @@
         </w:tc>
         <w:tc>
           <w:tcPr>
-            <w:tcW w:type="dxa" w:w="2409"/>
+            <w:tcW w:type="dxa" w:w="2425"/>
             <w:shd w:fill="FAFAF6" w:color="auto" w:val="clear"/>
             <w:tcMar>
               <w:top w:type="dxa" w:w="39"/>
@@ -3221,7 +3221,7 @@
         </w:tc>
         <w:tc>
           <w:tcPr>
-            <w:tcW w:type="dxa" w:w="2409"/>
+            <w:tcW w:type="dxa" w:w="2425"/>
             <w:shd w:fill="FAFAF6" w:color="auto" w:val="clear"/>
             <w:tcMar>
               <w:top w:type="dxa" w:w="39"/>
@@ -3248,7 +3248,7 @@
         </w:tc>
         <w:tc>
           <w:tcPr>
-            <w:tcW w:type="dxa" w:w="2409"/>
+            <w:tcW w:type="dxa" w:w="2425"/>
             <w:shd w:fill="FAFAF6" w:color="auto" w:val="clear"/>
             <w:tcMar>
               <w:top w:type="dxa" w:w="39"/>
@@ -3275,7 +3275,7 @@
         </w:tc>
         <w:tc>
           <w:tcPr>
-            <w:tcW w:type="dxa" w:w="2409"/>
+            <w:tcW w:type="dxa" w:w="2425"/>
             <w:shd w:fill="FAFAF6" w:color="auto" w:val="clear"/>
             <w:tcMar>
               <w:top w:type="dxa" w:w="39"/>
@@ -3302,7 +3302,7 @@
         </w:tc>
         <w:tc>
           <w:tcPr>
-            <w:tcW w:type="dxa" w:w="2409"/>
+            <w:tcW w:type="dxa" w:w="2425"/>
             <w:shd w:fill="FAFAF6" w:color="auto" w:val="clear"/>
             <w:tcMar>
               <w:top w:type="dxa" w:w="39"/>
@@ -3364,7 +3364,7 @@
         </w:tc>
         <w:tc>
           <w:tcPr>
-            <w:tcW w:type="dxa" w:w="2409"/>
+            <w:tcW w:type="dxa" w:w="2425"/>
             <w:shd w:fill="FFFFFF" w:color="auto" w:val="clear"/>
             <w:tcMar>
               <w:top w:type="dxa" w:w="39"/>
@@ -3391,7 +3391,7 @@
         </w:tc>
         <w:tc>
           <w:tcPr>
-            <w:tcW w:type="dxa" w:w="2409"/>
+            <w:tcW w:type="dxa" w:w="2425"/>
             <w:shd w:fill="FFFFFF" w:color="auto" w:val="clear"/>
             <w:tcMar>
               <w:top w:type="dxa" w:w="39"/>
@@ -3418,7 +3418,7 @@
         </w:tc>
         <w:tc>
           <w:tcPr>
-            <w:tcW w:type="dxa" w:w="2409"/>
+            <w:tcW w:type="dxa" w:w="2425"/>
             <w:shd w:fill="FFFFFF" w:color="auto" w:val="clear"/>
             <w:tcMar>
               <w:top w:type="dxa" w:w="39"/>
@@ -3445,7 +3445,7 @@
         </w:tc>
         <w:tc>
           <w:tcPr>
-            <w:tcW w:type="dxa" w:w="2409"/>
+            <w:tcW w:type="dxa" w:w="2425"/>
             <w:shd w:fill="FFFFFF" w:color="auto" w:val="clear"/>
             <w:tcMar>
               <w:top w:type="dxa" w:w="39"/>
@@ -3472,7 +3472,7 @@
         </w:tc>
         <w:tc>
           <w:tcPr>
-            <w:tcW w:type="dxa" w:w="2409"/>
+            <w:tcW w:type="dxa" w:w="2425"/>
             <w:shd w:fill="FFFFFF" w:color="auto" w:val="clear"/>
             <w:tcMar>
               <w:top w:type="dxa" w:w="39"/>
@@ -3499,7 +3499,7 @@
         </w:tc>
         <w:tc>
           <w:tcPr>
-            <w:tcW w:type="dxa" w:w="2409"/>
+            <w:tcW w:type="dxa" w:w="2425"/>
             <w:shd w:fill="FFFFFF" w:color="auto" w:val="clear"/>
             <w:tcMar>
               <w:top w:type="dxa" w:w="39"/>
@@ -3526,7 +3526,7 @@
         </w:tc>
         <w:tc>
           <w:tcPr>
-            <w:tcW w:type="dxa" w:w="2409"/>
+            <w:tcW w:type="dxa" w:w="2425"/>
             <w:shd w:fill="FFFFFF" w:color="auto" w:val="clear"/>
             <w:tcMar>
               <w:top w:type="dxa" w:w="39"/>
@@ -3674,7 +3674,7 @@
         </w:tc>
         <w:tc>
           <w:tcPr>
-            <w:tcW w:type="dxa" w:w="2409"/>
+            <w:tcW w:type="dxa" w:w="2425"/>
             <w:shd w:fill="FFFFFF" w:color="auto" w:val="clear"/>
             <w:tcMar>
               <w:top w:type="dxa" w:w="39"/>
@@ -3822,7 +3822,7 @@
         </w:tc>
         <w:tc>
           <w:tcPr>
-            <w:tcW w:type="dxa" w:w="2409"/>
+            <w:tcW w:type="dxa" w:w="2425"/>
             <w:shd w:fill="FFFFFF" w:color="auto" w:val="clear"/>
             <w:tcMar>
               <w:top w:type="dxa" w:w="39"/>
@@ -4005,7 +4005,7 @@
         </w:tc>
         <w:tc>
           <w:tcPr>
-            <w:tcW w:type="dxa" w:w="2409"/>
+            <w:tcW w:type="dxa" w:w="2425"/>
             <w:shd w:fill="FAFAF6" w:color="auto" w:val="clear"/>
             <w:tcMar>
               <w:top w:type="dxa" w:w="39"/>
@@ -4032,7 +4032,7 @@
         </w:tc>
         <w:tc>
           <w:tcPr>
-            <w:tcW w:type="dxa" w:w="2409"/>
+            <w:tcW w:type="dxa" w:w="2425"/>
             <w:shd w:fill="FAFAF6" w:color="auto" w:val="clear"/>
             <w:tcMar>
               <w:top w:type="dxa" w:w="39"/>
@@ -4180,7 +4180,7 @@
         </w:tc>
         <w:tc>
           <w:tcPr>
-            <w:tcW w:type="dxa" w:w="2409"/>
+            <w:tcW w:type="dxa" w:w="2425"/>
             <w:shd w:fill="FAFAF6" w:color="auto" w:val="clear"/>
             <w:tcMar>
               <w:top w:type="dxa" w:w="39"/>
@@ -4207,7 +4207,7 @@
         </w:tc>
         <w:tc>
           <w:tcPr>
-            <w:tcW w:type="dxa" w:w="2409"/>
+            <w:tcW w:type="dxa" w:w="2425"/>
             <w:shd w:fill="FAFAF6" w:color="auto" w:val="clear"/>
             <w:tcMar>
               <w:top w:type="dxa" w:w="39"/>
@@ -4234,7 +4234,7 @@
         </w:tc>
         <w:tc>
           <w:tcPr>
-            <w:tcW w:type="dxa" w:w="2409"/>
+            <w:tcW w:type="dxa" w:w="2425"/>
             <w:shd w:fill="FAFAF6" w:color="auto" w:val="clear"/>
             <w:tcMar>
               <w:top w:type="dxa" w:w="39"/>
@@ -4382,7 +4382,7 @@
         </w:tc>
         <w:tc>
           <w:tcPr>
-            <w:tcW w:type="dxa" w:w="2409"/>
+            <w:tcW w:type="dxa" w:w="2425"/>
             <w:shd w:fill="FAFAF6" w:color="auto" w:val="clear"/>
             <w:tcMar>
               <w:top w:type="dxa" w:w="39"/>
@@ -4530,7 +4530,7 @@
         </w:tc>
         <w:tc>
           <w:tcPr>
-            <w:tcW w:type="dxa" w:w="2409"/>
+            <w:tcW w:type="dxa" w:w="2425"/>
             <w:shd w:fill="FAFAF6" w:color="auto" w:val="clear"/>
             <w:tcMar>
               <w:top w:type="dxa" w:w="39"/>
@@ -4557,7 +4557,7 @@
         </w:tc>
         <w:tc>
           <w:tcPr>
-            <w:tcW w:type="dxa" w:w="2409"/>
+            <w:tcW w:type="dxa" w:w="2425"/>
             <w:shd w:fill="FAFAF6" w:color="auto" w:val="clear"/>
             <w:tcMar>
               <w:top w:type="dxa" w:w="39"/>
@@ -4584,7 +4584,7 @@
         </w:tc>
         <w:tc>
           <w:tcPr>
-            <w:tcW w:type="dxa" w:w="2409"/>
+            <w:tcW w:type="dxa" w:w="2425"/>
             <w:shd w:fill="FAFAF6" w:color="auto" w:val="clear"/>
             <w:tcMar>
               <w:top w:type="dxa" w:w="39"/>
@@ -4646,7 +4646,7 @@
         </w:tc>
         <w:tc>
           <w:tcPr>
-            <w:tcW w:type="dxa" w:w="2409"/>
+            <w:tcW w:type="dxa" w:w="2425"/>
             <w:shd w:fill="FFFFFF" w:color="auto" w:val="clear"/>
             <w:tcMar>
               <w:top w:type="dxa" w:w="39"/>
@@ -4673,7 +4673,7 @@
         </w:tc>
         <w:tc>
           <w:tcPr>
-            <w:tcW w:type="dxa" w:w="2409"/>
+            <w:tcW w:type="dxa" w:w="2425"/>
             <w:shd w:fill="FFFFFF" w:color="auto" w:val="clear"/>
             <w:tcMar>
               <w:top w:type="dxa" w:w="39"/>
@@ -4700,7 +4700,7 @@
         </w:tc>
         <w:tc>
           <w:tcPr>
-            <w:tcW w:type="dxa" w:w="2409"/>
+            <w:tcW w:type="dxa" w:w="2425"/>
             <w:shd w:fill="FFFFFF" w:color="auto" w:val="clear"/>
             <w:tcMar>
               <w:top w:type="dxa" w:w="39"/>
@@ -4727,7 +4727,7 @@
         </w:tc>
         <w:tc>
           <w:tcPr>
-            <w:tcW w:type="dxa" w:w="2409"/>
+            <w:tcW w:type="dxa" w:w="2425"/>
             <w:shd w:fill="FFFFFF" w:color="auto" w:val="clear"/>
             <w:tcMar>
               <w:top w:type="dxa" w:w="39"/>
@@ -4754,7 +4754,7 @@
         </w:tc>
         <w:tc>
           <w:tcPr>
-            <w:tcW w:type="dxa" w:w="2409"/>
+            <w:tcW w:type="dxa" w:w="2425"/>
             <w:shd w:fill="FFFFFF" w:color="auto" w:val="clear"/>
             <w:tcMar>
               <w:top w:type="dxa" w:w="39"/>
@@ -4781,7 +4781,7 @@
         </w:tc>
         <w:tc>
           <w:tcPr>
-            <w:tcW w:type="dxa" w:w="2409"/>
+            <w:tcW w:type="dxa" w:w="2425"/>
             <w:shd w:fill="FFFFFF" w:color="auto" w:val="clear"/>
             <w:tcMar>
               <w:top w:type="dxa" w:w="39"/>
@@ -4808,7 +4808,7 @@
         </w:tc>
         <w:tc>
           <w:tcPr>
-            <w:tcW w:type="dxa" w:w="2409"/>
+            <w:tcW w:type="dxa" w:w="2425"/>
             <w:shd w:fill="FFFFFF" w:color="auto" w:val="clear"/>
             <w:tcMar>
               <w:top w:type="dxa" w:w="39"/>
@@ -4835,7 +4835,7 @@
         </w:tc>
         <w:tc>
           <w:tcPr>
-            <w:tcW w:type="dxa" w:w="2409"/>
+            <w:tcW w:type="dxa" w:w="2425"/>
             <w:shd w:fill="FFFFFF" w:color="auto" w:val="clear"/>
             <w:tcMar>
               <w:top w:type="dxa" w:w="39"/>
@@ -4983,7 +4983,7 @@
         </w:tc>
         <w:tc>
           <w:tcPr>
-            <w:tcW w:type="dxa" w:w="2409"/>
+            <w:tcW w:type="dxa" w:w="2425"/>
             <w:shd w:fill="FFFFFF" w:color="auto" w:val="clear"/>
             <w:tcMar>
               <w:top w:type="dxa" w:w="39"/>
@@ -5045,7 +5045,7 @@
         </w:tc>
         <w:tc>
           <w:tcPr>
-            <w:tcW w:type="dxa" w:w="2409"/>
+            <w:tcW w:type="dxa" w:w="2425"/>
             <w:shd w:fill="FAFAF6" w:color="auto" w:val="clear"/>
             <w:tcMar>
               <w:top w:type="dxa" w:w="39"/>
@@ -5072,7 +5072,7 @@
         </w:tc>
         <w:tc>
           <w:tcPr>
-            <w:tcW w:type="dxa" w:w="2409"/>
+            <w:tcW w:type="dxa" w:w="2425"/>
             <w:shd w:fill="FAFAF6" w:color="auto" w:val="clear"/>
             <w:tcMar>
               <w:top w:type="dxa" w:w="39"/>
@@ -5197,7 +5197,7 @@
         </w:tc>
         <w:tc>
           <w:tcPr>
-            <w:tcW w:type="dxa" w:w="2409"/>
+            <w:tcW w:type="dxa" w:w="2425"/>
             <w:shd w:fill="FAFAF6" w:color="auto" w:val="clear"/>
             <w:tcMar>
               <w:top w:type="dxa" w:w="39"/>
@@ -5224,7 +5224,7 @@
         </w:tc>
         <w:tc>
           <w:tcPr>
-            <w:tcW w:type="dxa" w:w="2409"/>
+            <w:tcW w:type="dxa" w:w="2425"/>
             <w:shd w:fill="FAFAF6" w:color="auto" w:val="clear"/>
             <w:tcMar>
               <w:top w:type="dxa" w:w="39"/>
@@ -5251,7 +5251,7 @@
         </w:tc>
         <w:tc>
           <w:tcPr>
-            <w:tcW w:type="dxa" w:w="2409"/>
+            <w:tcW w:type="dxa" w:w="2425"/>
             <w:shd w:fill="FAFAF6" w:color="auto" w:val="clear"/>
             <w:tcMar>
               <w:top w:type="dxa" w:w="39"/>
@@ -5278,7 +5278,7 @@
         </w:tc>
         <w:tc>
           <w:tcPr>
-            <w:tcW w:type="dxa" w:w="2409"/>
+            <w:tcW w:type="dxa" w:w="2425"/>
             <w:shd w:fill="FAFAF6" w:color="auto" w:val="clear"/>
             <w:tcMar>
               <w:top w:type="dxa" w:w="39"/>
@@ -5305,7 +5305,7 @@
         </w:tc>
         <w:tc>
           <w:tcPr>
-            <w:tcW w:type="dxa" w:w="2409"/>
+            <w:tcW w:type="dxa" w:w="2425"/>
             <w:shd w:fill="FAFAF6" w:color="auto" w:val="clear"/>
             <w:tcMar>
               <w:top w:type="dxa" w:w="39"/>
@@ -5453,7 +5453,7 @@
         </w:tc>
         <w:tc>
           <w:tcPr>
-            <w:tcW w:type="dxa" w:w="2409"/>
+            <w:tcW w:type="dxa" w:w="2425"/>
             <w:shd w:fill="FAFAF6" w:color="auto" w:val="clear"/>
             <w:tcMar>
               <w:top w:type="dxa" w:w="39"/>
@@ -5480,7 +5480,7 @@
         </w:tc>
         <w:tc>
           <w:tcPr>
-            <w:tcW w:type="dxa" w:w="2409"/>
+            <w:tcW w:type="dxa" w:w="2425"/>
             <w:shd w:fill="FAFAF6" w:color="auto" w:val="clear"/>
             <w:tcMar>
               <w:top w:type="dxa" w:w="39"/>
@@ -5542,7 +5542,7 @@
         </w:tc>
         <w:tc>
           <w:tcPr>
-            <w:tcW w:type="dxa" w:w="2409"/>
+            <w:tcW w:type="dxa" w:w="2425"/>
             <w:shd w:fill="FFFFFF" w:color="auto" w:val="clear"/>
             <w:tcMar>
               <w:top w:type="dxa" w:w="39"/>
@@ -5569,7 +5569,7 @@
         </w:tc>
         <w:tc>
           <w:tcPr>
-            <w:tcW w:type="dxa" w:w="2409"/>
+            <w:tcW w:type="dxa" w:w="2425"/>
             <w:shd w:fill="FFFFFF" w:color="auto" w:val="clear"/>
             <w:tcMar>
               <w:top w:type="dxa" w:w="39"/>
@@ -5596,7 +5596,7 @@
         </w:tc>
         <w:tc>
           <w:tcPr>
-            <w:tcW w:type="dxa" w:w="2409"/>
+            <w:tcW w:type="dxa" w:w="2425"/>
             <w:shd w:fill="FFFFFF" w:color="auto" w:val="clear"/>
             <w:tcMar>
               <w:top w:type="dxa" w:w="39"/>
@@ -5623,7 +5623,7 @@
         </w:tc>
         <w:tc>
           <w:tcPr>
-            <w:tcW w:type="dxa" w:w="2409"/>
+            <w:tcW w:type="dxa" w:w="2425"/>
             <w:shd w:fill="FFFFFF" w:color="auto" w:val="clear"/>
             <w:tcMar>
               <w:top w:type="dxa" w:w="39"/>
@@ -5650,7 +5650,7 @@
         </w:tc>
         <w:tc>
           <w:tcPr>
-            <w:tcW w:type="dxa" w:w="2409"/>
+            <w:tcW w:type="dxa" w:w="2425"/>
             <w:shd w:fill="FFFFFF" w:color="auto" w:val="clear"/>
             <w:tcMar>
               <w:top w:type="dxa" w:w="39"/>
@@ -5798,7 +5798,7 @@
         </w:tc>
         <w:tc>
           <w:tcPr>
-            <w:tcW w:type="dxa" w:w="2409"/>
+            <w:tcW w:type="dxa" w:w="2425"/>
             <w:shd w:fill="FFFFFF" w:color="auto" w:val="clear"/>
             <w:tcMar>
               <w:top w:type="dxa" w:w="39"/>
@@ -5946,7 +5946,7 @@
         </w:tc>
         <w:tc>
           <w:tcPr>
-            <w:tcW w:type="dxa" w:w="2409"/>
+            <w:tcW w:type="dxa" w:w="2425"/>
             <w:shd w:fill="FFFFFF" w:color="auto" w:val="clear"/>
             <w:tcMar>
               <w:top w:type="dxa" w:w="39"/>
@@ -5973,7 +5973,7 @@
         </w:tc>
         <w:tc>
           <w:tcPr>
-            <w:tcW w:type="dxa" w:w="2409"/>
+            <w:tcW w:type="dxa" w:w="2425"/>
             <w:shd w:fill="FFFFFF" w:color="auto" w:val="clear"/>
             <w:tcMar>
               <w:top w:type="dxa" w:w="39"/>
@@ -6000,7 +6000,7 @@
         </w:tc>
         <w:tc>
           <w:tcPr>
-            <w:tcW w:type="dxa" w:w="2409"/>
+            <w:tcW w:type="dxa" w:w="2425"/>
             <w:shd w:fill="FFFFFF" w:color="auto" w:val="clear"/>
             <w:tcMar>
               <w:top w:type="dxa" w:w="39"/>
@@ -6062,7 +6062,7 @@
         </w:tc>
         <w:tc>
           <w:tcPr>
-            <w:tcW w:type="dxa" w:w="2409"/>
+            <w:tcW w:type="dxa" w:w="2425"/>
             <w:shd w:fill="FAFAF6" w:color="auto" w:val="clear"/>
             <w:tcMar>
               <w:top w:type="dxa" w:w="39"/>
@@ -6089,7 +6089,7 @@
         </w:tc>
         <w:tc>
           <w:tcPr>
-            <w:tcW w:type="dxa" w:w="2409"/>
+            <w:tcW w:type="dxa" w:w="2425"/>
             <w:shd w:fill="FAFAF6" w:color="auto" w:val="clear"/>
             <w:tcMar>
               <w:top w:type="dxa" w:w="39"/>
@@ -6116,7 +6116,7 @@
         </w:tc>
         <w:tc>
           <w:tcPr>
-            <w:tcW w:type="dxa" w:w="2409"/>
+            <w:tcW w:type="dxa" w:w="2425"/>
             <w:shd w:fill="FAFAF6" w:color="auto" w:val="clear"/>
             <w:tcMar>
               <w:top w:type="dxa" w:w="39"/>
@@ -6143,7 +6143,7 @@
         </w:tc>
         <w:tc>
           <w:tcPr>
-            <w:tcW w:type="dxa" w:w="2409"/>
+            <w:tcW w:type="dxa" w:w="2425"/>
             <w:shd w:fill="FAFAF6" w:color="auto" w:val="clear"/>
             <w:tcMar>
               <w:top w:type="dxa" w:w="39"/>
@@ -6170,7 +6170,7 @@
         </w:tc>
         <w:tc>
           <w:tcPr>
-            <w:tcW w:type="dxa" w:w="2409"/>
+            <w:tcW w:type="dxa" w:w="2425"/>
             <w:shd w:fill="FAFAF6" w:color="auto" w:val="clear"/>
             <w:tcMar>
               <w:top w:type="dxa" w:w="39"/>
@@ -6197,7 +6197,7 @@
         </w:tc>
         <w:tc>
           <w:tcPr>
-            <w:tcW w:type="dxa" w:w="2409"/>
+            <w:tcW w:type="dxa" w:w="2425"/>
             <w:shd w:fill="FAFAF6" w:color="auto" w:val="clear"/>
             <w:tcMar>
               <w:top w:type="dxa" w:w="39"/>
@@ -6224,7 +6224,7 @@
         </w:tc>
         <w:tc>
           <w:tcPr>
-            <w:tcW w:type="dxa" w:w="2409"/>
+            <w:tcW w:type="dxa" w:w="2425"/>
             <w:shd w:fill="FAFAF6" w:color="auto" w:val="clear"/>
             <w:tcMar>
               <w:top w:type="dxa" w:w="39"/>
@@ -6251,7 +6251,7 @@
         </w:tc>
         <w:tc>
           <w:tcPr>
-            <w:tcW w:type="dxa" w:w="2409"/>
+            <w:tcW w:type="dxa" w:w="2425"/>
             <w:shd w:fill="FAFAF6" w:color="auto" w:val="clear"/>
             <w:tcMar>
               <w:top w:type="dxa" w:w="39"/>
@@ -6278,7 +6278,7 @@
         </w:tc>
         <w:tc>
           <w:tcPr>
-            <w:tcW w:type="dxa" w:w="2409"/>
+            <w:tcW w:type="dxa" w:w="2425"/>
             <w:shd w:fill="FAFAF6" w:color="auto" w:val="clear"/>
             <w:tcMar>
               <w:top w:type="dxa" w:w="39"/>
@@ -6461,7 +6461,7 @@
         </w:tc>
         <w:tc>
           <w:tcPr>
-            <w:tcW w:type="dxa" w:w="2409"/>
+            <w:tcW w:type="dxa" w:w="2425"/>
             <w:shd w:fill="FFFFFF" w:color="auto" w:val="clear"/>
             <w:tcMar>
               <w:top w:type="dxa" w:w="39"/>
@@ -6488,7 +6488,7 @@
         </w:tc>
         <w:tc>
           <w:tcPr>
-            <w:tcW w:type="dxa" w:w="2409"/>
+            <w:tcW w:type="dxa" w:w="2425"/>
             <w:shd w:fill="FFFFFF" w:color="auto" w:val="clear"/>
             <w:tcMar>
               <w:top w:type="dxa" w:w="39"/>
@@ -6636,7 +6636,7 @@
         </w:tc>
         <w:tc>
           <w:tcPr>
-            <w:tcW w:type="dxa" w:w="2409"/>
+            <w:tcW w:type="dxa" w:w="2425"/>
             <w:shd w:fill="FFFFFF" w:color="auto" w:val="clear"/>
             <w:tcMar>
               <w:top w:type="dxa" w:w="39"/>
@@ -6663,7 +6663,7 @@
         </w:tc>
         <w:tc>
           <w:tcPr>
-            <w:tcW w:type="dxa" w:w="2409"/>
+            <w:tcW w:type="dxa" w:w="2425"/>
             <w:shd w:fill="FFFFFF" w:color="auto" w:val="clear"/>
             <w:tcMar>
               <w:top w:type="dxa" w:w="39"/>
@@ -6690,7 +6690,7 @@
         </w:tc>
         <w:tc>
           <w:tcPr>
-            <w:tcW w:type="dxa" w:w="2409"/>
+            <w:tcW w:type="dxa" w:w="2425"/>
             <w:shd w:fill="FFFFFF" w:color="auto" w:val="clear"/>
             <w:tcMar>
               <w:top w:type="dxa" w:w="39"/>
@@ -6838,7 +6838,7 @@
         </w:tc>
         <w:tc>
           <w:tcPr>
-            <w:tcW w:type="dxa" w:w="2409"/>
+            <w:tcW w:type="dxa" w:w="2425"/>
             <w:shd w:fill="FFFFFF" w:color="auto" w:val="clear"/>
             <w:tcMar>
               <w:top w:type="dxa" w:w="39"/>
@@ -6986,7 +6986,7 @@
         </w:tc>
         <w:tc>
           <w:tcPr>
-            <w:tcW w:type="dxa" w:w="2409"/>
+            <w:tcW w:type="dxa" w:w="2425"/>
             <w:shd w:fill="FFFFFF" w:color="auto" w:val="clear"/>
             <w:tcMar>
               <w:top w:type="dxa" w:w="39"/>
@@ -7134,7 +7134,7 @@
         </w:tc>
         <w:tc>
           <w:tcPr>
-            <w:tcW w:type="dxa" w:w="2409"/>
+            <w:tcW w:type="dxa" w:w="2425"/>
             <w:shd w:fill="FFFFFF" w:color="auto" w:val="clear"/>
             <w:tcMar>
               <w:top w:type="dxa" w:w="39"/>
@@ -7161,7 +7161,7 @@
         </w:tc>
         <w:tc>
           <w:tcPr>
-            <w:tcW w:type="dxa" w:w="2409"/>
+            <w:tcW w:type="dxa" w:w="2425"/>
             <w:shd w:fill="FFFFFF" w:color="auto" w:val="clear"/>
             <w:tcMar>
               <w:top w:type="dxa" w:w="39"/>
@@ -7223,7 +7223,7 @@
         </w:tc>
         <w:tc>
           <w:tcPr>
-            <w:tcW w:type="dxa" w:w="2409"/>
+            <w:tcW w:type="dxa" w:w="2425"/>
             <w:shd w:fill="FAFAF6" w:color="auto" w:val="clear"/>
             <w:tcMar>
               <w:top w:type="dxa" w:w="39"/>
@@ -7250,7 +7250,7 @@
         </w:tc>
         <w:tc>
           <w:tcPr>
-            <w:tcW w:type="dxa" w:w="2409"/>
+            <w:tcW w:type="dxa" w:w="2425"/>
             <w:shd w:fill="FAFAF6" w:color="auto" w:val="clear"/>
             <w:tcMar>
               <w:top w:type="dxa" w:w="39"/>
@@ -7277,7 +7277,7 @@
         </w:tc>
         <w:tc>
           <w:tcPr>
-            <w:tcW w:type="dxa" w:w="2409"/>
+            <w:tcW w:type="dxa" w:w="2425"/>
             <w:shd w:fill="FAFAF6" w:color="auto" w:val="clear"/>
             <w:tcMar>
               <w:top w:type="dxa" w:w="39"/>
@@ -7304,7 +7304,7 @@
         </w:tc>
         <w:tc>
           <w:tcPr>
-            <w:tcW w:type="dxa" w:w="2409"/>
+            <w:tcW w:type="dxa" w:w="2425"/>
             <w:shd w:fill="FAFAF6" w:color="auto" w:val="clear"/>
             <w:tcMar>
               <w:top w:type="dxa" w:w="39"/>
@@ -7331,7 +7331,7 @@
         </w:tc>
         <w:tc>
           <w:tcPr>
-            <w:tcW w:type="dxa" w:w="2409"/>
+            <w:tcW w:type="dxa" w:w="2425"/>
             <w:shd w:fill="FAFAF6" w:color="auto" w:val="clear"/>
             <w:tcMar>
               <w:top w:type="dxa" w:w="39"/>
@@ -7358,7 +7358,7 @@
         </w:tc>
         <w:tc>
           <w:tcPr>
-            <w:tcW w:type="dxa" w:w="2409"/>
+            <w:tcW w:type="dxa" w:w="2425"/>
             <w:shd w:fill="FAFAF6" w:color="auto" w:val="clear"/>
             <w:tcMar>
               <w:top w:type="dxa" w:w="39"/>
@@ -7385,7 +7385,7 @@
         </w:tc>
         <w:tc>
           <w:tcPr>
-            <w:tcW w:type="dxa" w:w="2409"/>
+            <w:tcW w:type="dxa" w:w="2425"/>
             <w:shd w:fill="FAFAF6" w:color="auto" w:val="clear"/>
             <w:tcMar>
               <w:top w:type="dxa" w:w="39"/>
@@ -7412,7 +7412,7 @@
         </w:tc>
         <w:tc>
           <w:tcPr>
-            <w:tcW w:type="dxa" w:w="2409"/>
+            <w:tcW w:type="dxa" w:w="2425"/>
             <w:shd w:fill="FAFAF6" w:color="auto" w:val="clear"/>
             <w:tcMar>
               <w:top w:type="dxa" w:w="39"/>
@@ -7439,7 +7439,7 @@
         </w:tc>
         <w:tc>
           <w:tcPr>
-            <w:tcW w:type="dxa" w:w="2409"/>
+            <w:tcW w:type="dxa" w:w="2425"/>
             <w:shd w:fill="FAFAF6" w:color="auto" w:val="clear"/>
             <w:tcMar>
               <w:top w:type="dxa" w:w="39"/>

</xml_diff>